<commit_message>
docs: add the final award plan, application terms and ceremony documents
Co-Authored-By: Claude Opus 5.5 <noreply@anthropic.com>
</commit_message>
<xml_diff>
--- a/docs/التصور التنفيذي لحفل الإطلاق الرسمي.docx
+++ b/docs/التصور التنفيذي لحفل الإطلاق الرسمي.docx
@@ -4,7 +4,7 @@
   <w:body>
     <w:p>
       <w:pPr>
-        <w:pStyle w:val="1"/>
+        <w:pStyle w:val="Heading1"/>
         <w:jc w:val="both"/>
         <w:rPr>
           <w:rtl/>
@@ -14,7 +14,14 @@
         <w:rPr>
           <w:rtl/>
         </w:rPr>
-        <w:t>جائزة الدكتور عبد القادر سنكري للثقافة والتراث والتنمية المجتمعية</w:t>
+        <w:t xml:space="preserve">جائزة الدكتور عبد القادر سنكري للثقافة والتراث </w:t>
+      </w:r>
+      <w:r>
+        <w:rPr>
+          <w:rFonts w:hint="cs"/>
+          <w:rtl/>
+        </w:rPr>
+        <w:t>والإبداع</w:t>
       </w:r>
     </w:p>
     <w:p>
@@ -28,7 +35,7 @@
     </w:p>
     <w:p>
       <w:pPr>
-        <w:pStyle w:val="1"/>
+        <w:pStyle w:val="Heading1"/>
         <w:jc w:val="both"/>
         <w:rPr>
           <w:lang w:val="en-US"/>
@@ -38,7 +45,7 @@
         <w:rPr>
           <w:rtl/>
         </w:rPr>
-        <w:t>التصور التنفيذي لحفل الإطلاق الرسمي</w:t>
+        <w:t>التصور التنفيذي لحفل الرسمي</w:t>
       </w:r>
     </w:p>
     <w:p>
@@ -54,7 +61,7 @@
     </w:p>
     <w:p>
       <w:pPr>
-        <w:pStyle w:val="2"/>
+        <w:pStyle w:val="Heading2"/>
         <w:jc w:val="both"/>
         <w:rPr>
           <w:lang w:val="en-US"/>
@@ -98,7 +105,14 @@
         <w:rPr>
           <w:rtl/>
         </w:rPr>
-        <w:t>جائزة الدكتور عبد القادر سنكري للثقافة والتراث والتنمية المجتمعية</w:t>
+        <w:t>جائزة الدكتور عبد القادر سنكري للثقافة والتراث وال</w:t>
+      </w:r>
+      <w:r>
+        <w:rPr>
+          <w:rFonts w:hint="cs"/>
+          <w:rtl/>
+        </w:rPr>
+        <w:t>إبداع</w:t>
       </w:r>
       <w:r>
         <w:t xml:space="preserve"> </w:t>
@@ -144,7 +158,7 @@
           <w:bCs/>
           <w:rtl/>
         </w:rPr>
-        <w:t>وفاءٌ للأثر... وتمكينٌ للمبادرة</w:t>
+        <w:t>وفاءٌ للأثر... تمكينٌ للمبادرة</w:t>
       </w:r>
       <w:r>
         <w:rPr>
@@ -196,154 +210,29 @@
     </w:p>
     <w:p>
       <w:pPr>
-        <w:numPr>
-          <w:ilvl w:val="0"/>
-          <w:numId w:val="43"/>
-        </w:numPr>
         <w:bidi/>
         <w:jc w:val="both"/>
       </w:pPr>
-      <w:r>
-        <w:rPr>
-          <w:b/>
-          <w:bCs/>
+    </w:p>
+    <w:p>
+      <w:pPr>
+        <w:pStyle w:val="Heading2"/>
+        <w:jc w:val="both"/>
+        <w:rPr>
           <w:rtl/>
         </w:rPr>
-        <w:t>الهدف من حفل الإطلاق</w:t>
-      </w:r>
-      <w:r>
-        <w:rPr>
-          <w:b/>
-          <w:bCs/>
-        </w:rPr>
-        <w:t>:</w:t>
-      </w:r>
-      <w:r>
-        <w:t xml:space="preserve"> </w:t>
-      </w:r>
-      <w:r>
-        <w:rPr>
-          <w:rtl/>
-        </w:rPr>
-        <w:t xml:space="preserve">الإعلان الرسمي عن إطلاق </w:t>
-      </w:r>
-      <w:proofErr w:type="gramStart"/>
-      <w:r>
-        <w:rPr>
-          <w:rtl/>
-        </w:rPr>
-        <w:t>المنصة  الموثوقة</w:t>
-      </w:r>
-      <w:proofErr w:type="gramEnd"/>
-      <w:r>
-        <w:rPr>
-          <w:rtl/>
-        </w:rPr>
-        <w:t xml:space="preserve"> لاكتشاف وتكريم المبادر</w:t>
-      </w:r>
+      </w:pPr>
       <w:r>
         <w:rPr>
           <w:rFonts w:hint="cs"/>
           <w:rtl/>
         </w:rPr>
-        <w:t xml:space="preserve">ة </w:t>
-      </w:r>
-      <w:r>
-        <w:rPr>
-          <w:rtl/>
-        </w:rPr>
-        <w:t xml:space="preserve">والتعريف بـ </w:t>
-      </w:r>
-      <w:r>
-        <w:rPr>
-          <w:b/>
-          <w:bCs/>
-          <w:rtl/>
-        </w:rPr>
-        <w:t>المحاور الستة للجائزة</w:t>
-      </w:r>
-      <w:r>
-        <w:rPr>
-          <w:rtl/>
-        </w:rPr>
-        <w:t xml:space="preserve"> الثقافة والفنون</w:t>
-      </w:r>
-      <w:r>
-        <w:rPr>
-          <w:rFonts w:hint="cs"/>
-          <w:rtl/>
-        </w:rPr>
-        <w:t xml:space="preserve"> و</w:t>
-      </w:r>
-      <w:r>
-        <w:rPr>
-          <w:rtl/>
-        </w:rPr>
-        <w:t>التراث المادي واللامادي، العمل التطوعي، المسؤولية المجتمعية، ريادة الأعمال والابتكار، ومحور الجودة المتقاطع</w:t>
-      </w:r>
-      <w:r>
-        <w:rPr>
-          <w:rFonts w:hint="cs"/>
-          <w:rtl/>
-        </w:rPr>
-        <w:t xml:space="preserve"> </w:t>
-      </w:r>
-      <w:r>
-        <w:rPr>
-          <w:rtl/>
-        </w:rPr>
-        <w:t>وفتح باب الترشيح الإلكتروني</w:t>
-      </w:r>
-      <w:r>
-        <w:t>.</w:t>
-      </w:r>
-    </w:p>
-    <w:p>
-      <w:pPr>
-        <w:bidi/>
-        <w:jc w:val="both"/>
-      </w:pPr>
-    </w:p>
-    <w:p>
-      <w:pPr>
-        <w:pStyle w:val="2"/>
-        <w:jc w:val="both"/>
-        <w:rPr>
-          <w:rtl/>
-        </w:rPr>
-      </w:pPr>
-      <w:proofErr w:type="gramStart"/>
-      <w:r>
-        <w:rPr>
-          <w:rtl/>
-        </w:rPr>
-        <w:t>الأجند</w:t>
-      </w:r>
-      <w:r>
-        <w:rPr>
-          <w:rFonts w:hint="cs"/>
-          <w:rtl/>
-        </w:rPr>
-        <w:t>ة</w:t>
-      </w:r>
-      <w:proofErr w:type="gramEnd"/>
-      <w:r>
-        <w:rPr>
-          <w:rFonts w:hint="cs"/>
-          <w:rtl/>
-        </w:rPr>
-        <w:t xml:space="preserve"> </w:t>
-      </w:r>
-      <w:r>
-        <w:rPr>
-          <w:rtl/>
-        </w:rPr>
-        <w:t xml:space="preserve">الزمنية الدقيقة للحفل </w:t>
+        <w:t>فقرات الحفل</w:t>
       </w:r>
     </w:p>
     <w:tbl>
       <w:tblPr>
-        <w:tblStyle w:val="ac"/>
+        <w:tblStyle w:val="TableGrid"/>
         <w:bidiVisual/>
         <w:tblW w:w="0" w:type="auto"/>
         <w:jc w:val="center"/>
@@ -660,22 +549,29 @@
             </w:pPr>
             <w:r>
               <w:rPr>
+                <w:rFonts w:hint="cs"/>
                 <w:rtl/>
               </w:rPr>
-              <w:t xml:space="preserve">الفيلم </w:t>
+              <w:t>برومو</w:t>
+            </w:r>
+            <w:r>
+              <w:rPr>
+                <w:rtl/>
+              </w:rPr>
+              <w:t xml:space="preserve"> </w:t>
             </w:r>
             <w:r>
               <w:rPr>
                 <w:rFonts w:hint="cs"/>
                 <w:rtl/>
               </w:rPr>
-              <w:t>الوثائقي (</w:t>
+              <w:t>(</w:t>
             </w:r>
             <w:r>
               <w:rPr>
                 <w:rtl/>
               </w:rPr>
-              <w:t xml:space="preserve">وفاءٌ للأثر... وتمكينٌ </w:t>
+              <w:t xml:space="preserve">وفاءٌ للأثر... تمكينٌ </w:t>
             </w:r>
             <w:r>
               <w:rPr>
@@ -761,9 +657,29 @@
             </w:pPr>
             <w:r>
               <w:rPr>
+                <w:rFonts w:hint="cs"/>
                 <w:rtl/>
               </w:rPr>
-              <w:t xml:space="preserve">كلمة مؤسسة الروّاد ومجلس الأمناء                                 </w:t>
+              <w:t xml:space="preserve">كلمة المؤسسات الرسمية: مديرية الثقافة </w:t>
+            </w:r>
+            <w:r>
+              <w:rPr>
+                <w:rtl/>
+              </w:rPr>
+              <w:t>–</w:t>
+            </w:r>
+            <w:r>
+              <w:rPr>
+                <w:rFonts w:hint="cs"/>
+                <w:rtl/>
+              </w:rPr>
+              <w:t xml:space="preserve"> محافظة حلب</w:t>
+            </w:r>
+            <w:r>
+              <w:rPr>
+                <w:rtl/>
+              </w:rPr>
+              <w:t xml:space="preserve">                           </w:t>
             </w:r>
           </w:p>
         </w:tc>
@@ -844,7 +760,20 @@
               <w:rPr>
                 <w:rtl/>
               </w:rPr>
-              <w:t xml:space="preserve">كلمة عائلة وأصدقاء الدكتور عبد القادر سنكري                      </w:t>
+              <w:t xml:space="preserve">كلمة </w:t>
+            </w:r>
+            <w:r>
+              <w:rPr>
+                <w:rFonts w:hint="cs"/>
+                <w:rtl/>
+              </w:rPr>
+              <w:t xml:space="preserve">مؤسسة الرواد: مجلس الأمناء - </w:t>
+            </w:r>
+            <w:r>
+              <w:rPr>
+                <w:rtl/>
+              </w:rPr>
+              <w:t>الدكتور عبد القادر سنكري</w:t>
             </w:r>
           </w:p>
         </w:tc>
@@ -923,7 +852,33 @@
               <w:rPr>
                 <w:rtl/>
               </w:rPr>
-              <w:t xml:space="preserve">العرض التعريفي: المحاور الستة، معايير التحكيم، ودليل الترشح      </w:t>
+              <w:t xml:space="preserve">العرض </w:t>
+            </w:r>
+            <w:r>
+              <w:rPr>
+                <w:rFonts w:hint="cs"/>
+                <w:rtl/>
+              </w:rPr>
+              <w:t>التقديمي</w:t>
+            </w:r>
+            <w:r>
+              <w:rPr>
+                <w:rtl/>
+              </w:rPr>
+              <w:t xml:space="preserve">: المحاور </w:t>
+            </w:r>
+            <w:r>
+              <w:rPr>
+                <w:rFonts w:hint="cs"/>
+                <w:rtl/>
+              </w:rPr>
+              <w:t>الثلاثة</w:t>
+            </w:r>
+            <w:r>
+              <w:rPr>
+                <w:rtl/>
+              </w:rPr>
+              <w:t xml:space="preserve">، معايير التحكيم، دليل الترشح      </w:t>
             </w:r>
           </w:p>
         </w:tc>
@@ -1002,7 +957,7 @@
               <w:rPr>
                 <w:rtl/>
               </w:rPr>
-              <w:t xml:space="preserve">اللوحة الفنية والتراثية الحية (أصداء الأثر) </w:t>
+              <w:t xml:space="preserve">اللوحة الفنية (أصداء الأثر) </w:t>
             </w:r>
           </w:p>
         </w:tc>
@@ -1097,9 +1052,10 @@
             </w:pPr>
             <w:r>
               <w:rPr>
+                <w:rFonts w:hint="cs"/>
                 <w:rtl/>
               </w:rPr>
-              <w:t xml:space="preserve">التدشين الرسمي للمنصة الرقمية وتدشين شارة بدء الترشيح             </w:t>
+              <w:t>توزيع الجوائز</w:t>
             </w:r>
           </w:p>
         </w:tc>
@@ -1125,7 +1081,16 @@
                 <w:bCs/>
                 <w:rtl/>
               </w:rPr>
-              <w:t xml:space="preserve">10 د </w:t>
+              <w:t>20</w:t>
+            </w:r>
+            <w:r>
+              <w:rPr>
+                <w:rFonts w:hint="cs"/>
+                <w:b/>
+                <w:bCs/>
+                <w:rtl/>
+              </w:rPr>
+              <w:t xml:space="preserve"> د </w:t>
             </w:r>
           </w:p>
         </w:tc>
@@ -1176,9 +1141,10 @@
             </w:pPr>
             <w:r>
               <w:rPr>
+                <w:rFonts w:hint="cs"/>
                 <w:rtl/>
               </w:rPr>
-              <w:t xml:space="preserve">الصورة الجماعية والختام ودعوة للضيافة والمعرض المصاحب           </w:t>
+              <w:t>الختام</w:t>
             </w:r>
           </w:p>
         </w:tc>
@@ -1206,6 +1172,15 @@
               </w:rPr>
               <w:t xml:space="preserve">10 </w:t>
             </w:r>
+            <w:r>
+              <w:rPr>
+                <w:rFonts w:hint="cs"/>
+                <w:b/>
+                <w:bCs/>
+                <w:rtl/>
+              </w:rPr>
+              <w:t>د</w:t>
+            </w:r>
           </w:p>
         </w:tc>
       </w:tr>
@@ -1254,7 +1229,7 @@
     </w:p>
     <w:p>
       <w:pPr>
-        <w:pStyle w:val="2"/>
+        <w:pStyle w:val="Heading2"/>
         <w:jc w:val="both"/>
         <w:rPr>
           <w:lang w:val="en-US"/>
@@ -1264,6 +1239,7 @@
         <w:rPr>
           <w:rtl/>
         </w:rPr>
+        <w:lastRenderedPageBreak/>
         <w:t>تفاصيل فقرات الحفل</w:t>
       </w:r>
       <w:r>
@@ -1879,6 +1855,7 @@
           <w:bCs/>
           <w:rtl/>
         </w:rPr>
+        <w:lastRenderedPageBreak/>
         <w:t>الفقرة السابعة: اللوحة الفنية والتراثية الحية (1</w:t>
       </w:r>
       <w:r>
@@ -1947,7 +1924,7 @@
           <w:bCs/>
           <w:rtl/>
         </w:rPr>
-        <w:t>الفقرة الثامنة: التدشين الرسمي وإطلاق شارة الترشيح (1</w:t>
+        <w:t xml:space="preserve">الفقرة الثامنة: </w:t>
       </w:r>
       <w:r>
         <w:rPr>
@@ -1956,15 +1933,51 @@
           <w:bCs/>
           <w:rtl/>
         </w:rPr>
-        <w:t>0</w:t>
-      </w:r>
-      <w:r>
-        <w:rPr>
+        <w:t xml:space="preserve">توزيع </w:t>
+      </w:r>
+      <w:proofErr w:type="gramStart"/>
+      <w:r>
+        <w:rPr>
+          <w:rFonts w:hint="cs"/>
           <w:b/>
           <w:bCs/>
           <w:rtl/>
         </w:rPr>
-        <w:t xml:space="preserve"> دقيقة)</w:t>
+        <w:t xml:space="preserve">الجوائز </w:t>
+      </w:r>
+      <w:r>
+        <w:rPr>
+          <w:b/>
+          <w:bCs/>
+          <w:rtl/>
+        </w:rPr>
+        <w:t xml:space="preserve"> (</w:t>
+      </w:r>
+      <w:r>
+        <w:rPr>
+          <w:rFonts w:hint="cs"/>
+          <w:b/>
+          <w:bCs/>
+          <w:rtl/>
+        </w:rPr>
+        <w:t xml:space="preserve">20 </w:t>
+      </w:r>
+      <w:r>
+        <w:rPr>
+          <w:b/>
+          <w:bCs/>
+          <w:rtl/>
+        </w:rPr>
+        <w:t xml:space="preserve"> دقيقة</w:t>
+      </w:r>
+      <w:proofErr w:type="gramEnd"/>
+      <w:r>
+        <w:rPr>
+          <w:b/>
+          <w:bCs/>
+          <w:rtl/>
+        </w:rPr>
+        <w:t>)</w:t>
       </w:r>
     </w:p>
     <w:p>
@@ -2034,7 +2047,7 @@
           <w:bCs/>
           <w:rtl/>
         </w:rPr>
-        <w:t>الفقرة التاسعة: الصورة الجماعية والختام (8 دقائق)</w:t>
+        <w:t>الفقرة التاسعة: الختام (8 دقائق)</w:t>
       </w:r>
     </w:p>
     <w:p>
@@ -2091,7 +2104,7 @@
     </w:p>
     <w:p>
       <w:pPr>
-        <w:pStyle w:val="2"/>
+        <w:pStyle w:val="Heading2"/>
         <w:jc w:val="both"/>
         <w:rPr>
           <w:lang w:val="en-US"/>
@@ -2288,7 +2301,7 @@
 <w:hdr xmlns:wpc="http://schemas.microsoft.com/office/word/2010/wordprocessingCanvas" xmlns:cx="http://schemas.microsoft.com/office/drawing/2014/chartex" xmlns:cx1="http://schemas.microsoft.com/office/drawing/2015/9/8/chartex" xmlns:cx2="http://schemas.microsoft.com/office/drawing/2015/10/21/chartex" xmlns:cx3="http://schemas.microsoft.com/office/drawing/2016/5/9/chartex" xmlns:cx4="http://schemas.microsoft.com/office/drawing/2016/5/10/chartex" xmlns:cx5="http://schemas.microsoft.com/office/drawing/2016/5/11/chartex" xmlns:cx6="http://schemas.microsoft.com/office/drawing/2016/5/12/chartex" xmlns:cx7="http://schemas.microsoft.com/office/drawing/2016/5/13/chartex" xmlns:cx8="http://schemas.microsoft.com/office/drawing/2016/5/14/chartex" xmlns:mc="http://schemas.openxmlformats.org/markup-compatibility/2006" xmlns:aink="http://schemas.microsoft.com/office/drawing/2016/ink" xmlns:am3d="http://schemas.microsoft.com/office/drawing/2017/model3d" xmlns:o="urn:schemas-microsoft-com:office:office" xmlns:oel="http://schemas.microsoft.com/office/2019/extlst" xmlns:r="http://schemas.openxmlformats.org/officeDocument/2006/relationships" xmlns:m="http://schemas.openxmlformats.org/officeDocument/2006/math" xmlns:v="urn:schemas-microsoft-com:vml" xmlns:wp14="http://schemas.microsoft.com/office/word/2010/wordprocessingDrawing" xmlns:wp="http://schemas.openxmlformats.org/drawingml/2006/wordprocessingDrawing" xmlns:w10="urn:schemas-microsoft-com:office:word" xmlns:w="http://schemas.openxmlformats.org/wordprocessingml/2006/main" xmlns:w14="http://schemas.microsoft.com/office/word/2010/wordml" xmlns:w15="http://schemas.microsoft.com/office/word/2012/wordml" xmlns:w16cex="http://schemas.microsoft.com/office/word/2018/wordml/cex" xmlns:w16cid="http://schemas.microsoft.com/office/word/2016/wordml/cid" xmlns:w16="http://schemas.microsoft.com/office/word/2018/wordml" xmlns:w16du="http://schemas.microsoft.com/office/word/2023/wordml/word16du" xmlns:w16sdtdh="http://schemas.microsoft.com/office/word/2020/wordml/sdtdatahash" xmlns:w16sdtfl="http://schemas.microsoft.com/office/word/2024/wordml/sdtformatlock" xmlns:w16se="http://schemas.microsoft.com/office/word/2015/wordml/symex" xmlns:wpg="http://schemas.microsoft.com/office/word/2010/wordprocessingGroup" xmlns:wpi="http://schemas.microsoft.com/office/word/2010/wordprocessingInk" xmlns:wne="http://schemas.microsoft.com/office/word/2006/wordml" xmlns:wps="http://schemas.microsoft.com/office/word/2010/wordprocessingShape" mc:Ignorable="w14 w15 w16se w16cid w16 w16cex w16sdtdh w16sdtfl w16du wp14">
   <w:p>
     <w:pPr>
-      <w:pStyle w:val="aa"/>
+      <w:pStyle w:val="Header"/>
     </w:pPr>
     <w:r>
       <w:rPr>
@@ -2364,7 +2377,7 @@
 <w:hdr xmlns:wpc="http://schemas.microsoft.com/office/word/2010/wordprocessingCanvas" xmlns:cx="http://schemas.microsoft.com/office/drawing/2014/chartex" xmlns:cx1="http://schemas.microsoft.com/office/drawing/2015/9/8/chartex" xmlns:cx2="http://schemas.microsoft.com/office/drawing/2015/10/21/chartex" xmlns:cx3="http://schemas.microsoft.com/office/drawing/2016/5/9/chartex" xmlns:cx4="http://schemas.microsoft.com/office/drawing/2016/5/10/chartex" xmlns:cx5="http://schemas.microsoft.com/office/drawing/2016/5/11/chartex" xmlns:cx6="http://schemas.microsoft.com/office/drawing/2016/5/12/chartex" xmlns:cx7="http://schemas.microsoft.com/office/drawing/2016/5/13/chartex" xmlns:cx8="http://schemas.microsoft.com/office/drawing/2016/5/14/chartex" xmlns:mc="http://schemas.openxmlformats.org/markup-compatibility/2006" xmlns:aink="http://schemas.microsoft.com/office/drawing/2016/ink" xmlns:am3d="http://schemas.microsoft.com/office/drawing/2017/model3d" xmlns:o="urn:schemas-microsoft-com:office:office" xmlns:oel="http://schemas.microsoft.com/office/2019/extlst" xmlns:r="http://schemas.openxmlformats.org/officeDocument/2006/relationships" xmlns:m="http://schemas.openxmlformats.org/officeDocument/2006/math" xmlns:v="urn:schemas-microsoft-com:vml" xmlns:wp14="http://schemas.microsoft.com/office/word/2010/wordprocessingDrawing" xmlns:wp="http://schemas.openxmlformats.org/drawingml/2006/wordprocessingDrawing" xmlns:w10="urn:schemas-microsoft-com:office:word" xmlns:w="http://schemas.openxmlformats.org/wordprocessingml/2006/main" xmlns:w14="http://schemas.microsoft.com/office/word/2010/wordml" xmlns:w15="http://schemas.microsoft.com/office/word/2012/wordml" xmlns:w16cex="http://schemas.microsoft.com/office/word/2018/wordml/cex" xmlns:w16cid="http://schemas.microsoft.com/office/word/2016/wordml/cid" xmlns:w16="http://schemas.microsoft.com/office/word/2018/wordml" xmlns:w16du="http://schemas.microsoft.com/office/word/2023/wordml/word16du" xmlns:w16sdtdh="http://schemas.microsoft.com/office/word/2020/wordml/sdtdatahash" xmlns:w16sdtfl="http://schemas.microsoft.com/office/word/2024/wordml/sdtformatlock" xmlns:w16se="http://schemas.microsoft.com/office/word/2015/wordml/symex" xmlns:wpg="http://schemas.microsoft.com/office/word/2010/wordprocessingGroup" xmlns:wpi="http://schemas.microsoft.com/office/word/2010/wordprocessingInk" xmlns:wne="http://schemas.microsoft.com/office/word/2006/wordml" xmlns:wps="http://schemas.microsoft.com/office/word/2010/wordprocessingShape" mc:Ignorable="w14 w15 w16se w16cid w16 w16cex w16sdtdh w16sdtfl w16du wp14">
   <w:p>
     <w:pPr>
-      <w:pStyle w:val="aa"/>
+      <w:pStyle w:val="Header"/>
     </w:pPr>
     <w:r>
       <w:rPr>
@@ -8588,7 +8601,7 @@
     <w:lsdException w:name="Unresolved Mention" w:locked="0" w:semiHidden="1" w:unhideWhenUsed="1"/>
     <w:lsdException w:name="Smart Link" w:semiHidden="1" w:unhideWhenUsed="1"/>
   </w:latentStyles>
-  <w:style w:type="paragraph" w:default="1" w:styleId="a">
+  <w:style w:type="paragraph" w:default="1" w:styleId="Normal">
     <w:name w:val="Normal"/>
     <w:qFormat/>
     <w:rsid w:val="009D4C46"/>
@@ -8596,11 +8609,11 @@
       <w:rFonts w:ascii="Sakkal Majalla" w:eastAsia="Sakkal Majalla" w:hAnsi="Sakkal Majalla" w:cs="Sakkal Majalla"/>
     </w:rPr>
   </w:style>
-  <w:style w:type="paragraph" w:styleId="1">
+  <w:style w:type="paragraph" w:styleId="Heading1">
     <w:name w:val="heading 1"/>
-    <w:basedOn w:val="a"/>
-    <w:next w:val="a"/>
-    <w:link w:val="1Char"/>
+    <w:basedOn w:val="Normal"/>
+    <w:next w:val="Normal"/>
+    <w:link w:val="Heading1Char"/>
     <w:autoRedefine/>
     <w:uiPriority w:val="9"/>
     <w:qFormat/>
@@ -8622,11 +8635,11 @@
       <w:lang w:val="tr-TR"/>
     </w:rPr>
   </w:style>
-  <w:style w:type="paragraph" w:styleId="2">
+  <w:style w:type="paragraph" w:styleId="Heading2">
     <w:name w:val="heading 2"/>
-    <w:basedOn w:val="a"/>
-    <w:next w:val="a"/>
-    <w:link w:val="2Char"/>
+    <w:basedOn w:val="Normal"/>
+    <w:next w:val="Normal"/>
+    <w:link w:val="Heading2Char"/>
     <w:autoRedefine/>
     <w:uiPriority w:val="9"/>
     <w:unhideWhenUsed/>
@@ -8649,11 +8662,11 @@
       <w:lang w:val="tr-TR"/>
     </w:rPr>
   </w:style>
-  <w:style w:type="paragraph" w:styleId="3">
+  <w:style w:type="paragraph" w:styleId="Heading3">
     <w:name w:val="heading 3"/>
-    <w:basedOn w:val="a"/>
-    <w:next w:val="a"/>
-    <w:link w:val="3Char"/>
+    <w:basedOn w:val="Normal"/>
+    <w:next w:val="Normal"/>
+    <w:link w:val="Heading3Char"/>
     <w:uiPriority w:val="9"/>
     <w:unhideWhenUsed/>
     <w:locked/>
@@ -8671,11 +8684,11 @@
       <w:szCs w:val="28"/>
     </w:rPr>
   </w:style>
-  <w:style w:type="paragraph" w:styleId="4">
+  <w:style w:type="paragraph" w:styleId="Heading4">
     <w:name w:val="heading 4"/>
-    <w:basedOn w:val="a"/>
-    <w:next w:val="a"/>
-    <w:link w:val="4Char"/>
+    <w:basedOn w:val="Normal"/>
+    <w:next w:val="Normal"/>
+    <w:link w:val="Heading4Char"/>
     <w:uiPriority w:val="9"/>
     <w:semiHidden/>
     <w:unhideWhenUsed/>
@@ -8694,11 +8707,11 @@
       <w:color w:val="B43412" w:themeColor="accent1" w:themeShade="BF"/>
     </w:rPr>
   </w:style>
-  <w:style w:type="paragraph" w:styleId="5">
+  <w:style w:type="paragraph" w:styleId="Heading5">
     <w:name w:val="heading 5"/>
-    <w:basedOn w:val="a"/>
-    <w:next w:val="a"/>
-    <w:link w:val="5Char"/>
+    <w:basedOn w:val="Normal"/>
+    <w:next w:val="Normal"/>
+    <w:link w:val="Heading5Char"/>
     <w:uiPriority w:val="9"/>
     <w:semiHidden/>
     <w:unhideWhenUsed/>
@@ -8716,11 +8729,11 @@
       <w:color w:val="B43412" w:themeColor="accent1" w:themeShade="BF"/>
     </w:rPr>
   </w:style>
-  <w:style w:type="paragraph" w:styleId="6">
+  <w:style w:type="paragraph" w:styleId="Heading6">
     <w:name w:val="heading 6"/>
-    <w:basedOn w:val="a"/>
-    <w:next w:val="a"/>
-    <w:link w:val="6Char"/>
+    <w:basedOn w:val="Normal"/>
+    <w:next w:val="Normal"/>
+    <w:link w:val="Heading6Char"/>
     <w:uiPriority w:val="9"/>
     <w:semiHidden/>
     <w:unhideWhenUsed/>
@@ -8740,11 +8753,11 @@
       <w:color w:val="595959" w:themeColor="text1" w:themeTint="A6"/>
     </w:rPr>
   </w:style>
-  <w:style w:type="paragraph" w:styleId="7">
+  <w:style w:type="paragraph" w:styleId="Heading7">
     <w:name w:val="heading 7"/>
-    <w:basedOn w:val="a"/>
-    <w:next w:val="a"/>
-    <w:link w:val="7Char"/>
+    <w:basedOn w:val="Normal"/>
+    <w:next w:val="Normal"/>
+    <w:link w:val="Heading7Char"/>
     <w:uiPriority w:val="9"/>
     <w:semiHidden/>
     <w:unhideWhenUsed/>
@@ -8762,11 +8775,11 @@
       <w:color w:val="595959" w:themeColor="text1" w:themeTint="A6"/>
     </w:rPr>
   </w:style>
-  <w:style w:type="paragraph" w:styleId="8">
+  <w:style w:type="paragraph" w:styleId="Heading8">
     <w:name w:val="heading 8"/>
-    <w:basedOn w:val="a"/>
-    <w:next w:val="a"/>
-    <w:link w:val="8Char"/>
+    <w:basedOn w:val="Normal"/>
+    <w:next w:val="Normal"/>
+    <w:link w:val="Heading8Char"/>
     <w:uiPriority w:val="9"/>
     <w:semiHidden/>
     <w:unhideWhenUsed/>
@@ -8786,11 +8799,11 @@
       <w:color w:val="272727" w:themeColor="text1" w:themeTint="D8"/>
     </w:rPr>
   </w:style>
-  <w:style w:type="paragraph" w:styleId="9">
+  <w:style w:type="paragraph" w:styleId="Heading9">
     <w:name w:val="heading 9"/>
-    <w:basedOn w:val="a"/>
-    <w:next w:val="a"/>
-    <w:link w:val="9Char"/>
+    <w:basedOn w:val="Normal"/>
+    <w:next w:val="Normal"/>
+    <w:link w:val="Heading9Char"/>
     <w:uiPriority w:val="9"/>
     <w:semiHidden/>
     <w:unhideWhenUsed/>
@@ -8808,13 +8821,13 @@
       <w:color w:val="272727" w:themeColor="text1" w:themeTint="D8"/>
     </w:rPr>
   </w:style>
-  <w:style w:type="character" w:default="1" w:styleId="a0">
+  <w:style w:type="character" w:default="1" w:styleId="DefaultParagraphFont">
     <w:name w:val="Default Paragraph Font"/>
     <w:uiPriority w:val="1"/>
     <w:semiHidden/>
     <w:unhideWhenUsed/>
   </w:style>
-  <w:style w:type="table" w:default="1" w:styleId="a1">
+  <w:style w:type="table" w:default="1" w:styleId="TableNormal">
     <w:name w:val="Normal Table"/>
     <w:uiPriority w:val="99"/>
     <w:semiHidden/>
@@ -8829,16 +8842,16 @@
       </w:tblCellMar>
     </w:tblPr>
   </w:style>
-  <w:style w:type="numbering" w:default="1" w:styleId="a2">
+  <w:style w:type="numbering" w:default="1" w:styleId="NoList">
     <w:name w:val="No List"/>
     <w:uiPriority w:val="99"/>
     <w:semiHidden/>
     <w:unhideWhenUsed/>
   </w:style>
-  <w:style w:type="character" w:customStyle="1" w:styleId="1Char">
-    <w:name w:val="العنوان 1 Char"/>
-    <w:basedOn w:val="a0"/>
-    <w:link w:val="1"/>
+  <w:style w:type="character" w:customStyle="1" w:styleId="Heading1Char">
+    <w:name w:val="Heading 1 Char"/>
+    <w:basedOn w:val="DefaultParagraphFont"/>
+    <w:link w:val="Heading1"/>
     <w:uiPriority w:val="9"/>
     <w:rsid w:val="005B4C0E"/>
     <w:rPr>
@@ -8851,10 +8864,10 @@
       <w:lang w:val="tr-TR"/>
     </w:rPr>
   </w:style>
-  <w:style w:type="character" w:customStyle="1" w:styleId="2Char">
-    <w:name w:val="عنوان 2 Char"/>
-    <w:basedOn w:val="a0"/>
-    <w:link w:val="2"/>
+  <w:style w:type="character" w:customStyle="1" w:styleId="Heading2Char">
+    <w:name w:val="Heading 2 Char"/>
+    <w:basedOn w:val="DefaultParagraphFont"/>
+    <w:link w:val="Heading2"/>
     <w:uiPriority w:val="9"/>
     <w:rsid w:val="005B4C0E"/>
     <w:rPr>
@@ -8867,10 +8880,10 @@
       <w:lang w:val="tr-TR"/>
     </w:rPr>
   </w:style>
-  <w:style w:type="character" w:customStyle="1" w:styleId="3Char">
-    <w:name w:val="عنوان 3 Char"/>
-    <w:basedOn w:val="a0"/>
-    <w:link w:val="3"/>
+  <w:style w:type="character" w:customStyle="1" w:styleId="Heading3Char">
+    <w:name w:val="Heading 3 Char"/>
+    <w:basedOn w:val="DefaultParagraphFont"/>
+    <w:link w:val="Heading3"/>
     <w:uiPriority w:val="9"/>
     <w:rsid w:val="00D631E6"/>
     <w:rPr>
@@ -8880,10 +8893,10 @@
       <w:szCs w:val="28"/>
     </w:rPr>
   </w:style>
-  <w:style w:type="character" w:customStyle="1" w:styleId="4Char">
-    <w:name w:val="عنوان 4 Char"/>
-    <w:basedOn w:val="a0"/>
-    <w:link w:val="4"/>
+  <w:style w:type="character" w:customStyle="1" w:styleId="Heading4Char">
+    <w:name w:val="Heading 4 Char"/>
+    <w:basedOn w:val="DefaultParagraphFont"/>
+    <w:link w:val="Heading4"/>
     <w:uiPriority w:val="9"/>
     <w:semiHidden/>
     <w:rsid w:val="00D631E6"/>
@@ -8894,10 +8907,10 @@
       <w:color w:val="B43412" w:themeColor="accent1" w:themeShade="BF"/>
     </w:rPr>
   </w:style>
-  <w:style w:type="character" w:customStyle="1" w:styleId="5Char">
-    <w:name w:val="عنوان 5 Char"/>
-    <w:basedOn w:val="a0"/>
-    <w:link w:val="5"/>
+  <w:style w:type="character" w:customStyle="1" w:styleId="Heading5Char">
+    <w:name w:val="Heading 5 Char"/>
+    <w:basedOn w:val="DefaultParagraphFont"/>
+    <w:link w:val="Heading5"/>
     <w:uiPriority w:val="9"/>
     <w:semiHidden/>
     <w:rsid w:val="00D631E6"/>
@@ -8906,10 +8919,10 @@
       <w:color w:val="B43412" w:themeColor="accent1" w:themeShade="BF"/>
     </w:rPr>
   </w:style>
-  <w:style w:type="character" w:customStyle="1" w:styleId="6Char">
-    <w:name w:val="عنوان 6 Char"/>
-    <w:basedOn w:val="a0"/>
-    <w:link w:val="6"/>
+  <w:style w:type="character" w:customStyle="1" w:styleId="Heading6Char">
+    <w:name w:val="Heading 6 Char"/>
+    <w:basedOn w:val="DefaultParagraphFont"/>
+    <w:link w:val="Heading6"/>
     <w:uiPriority w:val="9"/>
     <w:semiHidden/>
     <w:rsid w:val="00D631E6"/>
@@ -8920,10 +8933,10 @@
       <w:color w:val="595959" w:themeColor="text1" w:themeTint="A6"/>
     </w:rPr>
   </w:style>
-  <w:style w:type="character" w:customStyle="1" w:styleId="7Char">
-    <w:name w:val="عنوان 7 Char"/>
-    <w:basedOn w:val="a0"/>
-    <w:link w:val="7"/>
+  <w:style w:type="character" w:customStyle="1" w:styleId="Heading7Char">
+    <w:name w:val="Heading 7 Char"/>
+    <w:basedOn w:val="DefaultParagraphFont"/>
+    <w:link w:val="Heading7"/>
     <w:uiPriority w:val="9"/>
     <w:semiHidden/>
     <w:rsid w:val="00D631E6"/>
@@ -8932,10 +8945,10 @@
       <w:color w:val="595959" w:themeColor="text1" w:themeTint="A6"/>
     </w:rPr>
   </w:style>
-  <w:style w:type="character" w:customStyle="1" w:styleId="8Char">
-    <w:name w:val="عنوان 8 Char"/>
-    <w:basedOn w:val="a0"/>
-    <w:link w:val="8"/>
+  <w:style w:type="character" w:customStyle="1" w:styleId="Heading8Char">
+    <w:name w:val="Heading 8 Char"/>
+    <w:basedOn w:val="DefaultParagraphFont"/>
+    <w:link w:val="Heading8"/>
     <w:uiPriority w:val="9"/>
     <w:semiHidden/>
     <w:rsid w:val="00D631E6"/>
@@ -8946,10 +8959,10 @@
       <w:color w:val="272727" w:themeColor="text1" w:themeTint="D8"/>
     </w:rPr>
   </w:style>
-  <w:style w:type="character" w:customStyle="1" w:styleId="9Char">
-    <w:name w:val="عنوان 9 Char"/>
-    <w:basedOn w:val="a0"/>
-    <w:link w:val="9"/>
+  <w:style w:type="character" w:customStyle="1" w:styleId="Heading9Char">
+    <w:name w:val="Heading 9 Char"/>
+    <w:basedOn w:val="DefaultParagraphFont"/>
+    <w:link w:val="Heading9"/>
     <w:uiPriority w:val="9"/>
     <w:semiHidden/>
     <w:rsid w:val="00D631E6"/>
@@ -8958,11 +8971,11 @@
       <w:color w:val="272727" w:themeColor="text1" w:themeTint="D8"/>
     </w:rPr>
   </w:style>
-  <w:style w:type="paragraph" w:styleId="a3">
+  <w:style w:type="paragraph" w:styleId="Title">
     <w:name w:val="Title"/>
-    <w:basedOn w:val="a"/>
-    <w:next w:val="a"/>
-    <w:link w:val="Char"/>
+    <w:basedOn w:val="Normal"/>
+    <w:next w:val="Normal"/>
+    <w:link w:val="TitleChar"/>
     <w:uiPriority w:val="10"/>
     <w:locked/>
     <w:rsid w:val="00D631E6"/>
@@ -8978,10 +8991,10 @@
       <w:szCs w:val="56"/>
     </w:rPr>
   </w:style>
-  <w:style w:type="character" w:customStyle="1" w:styleId="Char">
-    <w:name w:val="العنوان Char"/>
-    <w:basedOn w:val="a0"/>
-    <w:link w:val="a3"/>
+  <w:style w:type="character" w:customStyle="1" w:styleId="TitleChar">
+    <w:name w:val="Title Char"/>
+    <w:basedOn w:val="DefaultParagraphFont"/>
+    <w:link w:val="Title"/>
     <w:uiPriority w:val="10"/>
     <w:rsid w:val="00D631E6"/>
     <w:rPr>
@@ -8992,11 +9005,11 @@
       <w:szCs w:val="56"/>
     </w:rPr>
   </w:style>
-  <w:style w:type="paragraph" w:styleId="a4">
+  <w:style w:type="paragraph" w:styleId="Subtitle">
     <w:name w:val="Subtitle"/>
-    <w:basedOn w:val="a"/>
-    <w:next w:val="a"/>
-    <w:link w:val="Char0"/>
+    <w:basedOn w:val="Normal"/>
+    <w:next w:val="Normal"/>
+    <w:link w:val="SubtitleChar"/>
     <w:uiPriority w:val="11"/>
     <w:locked/>
     <w:rsid w:val="00D631E6"/>
@@ -9013,10 +9026,10 @@
       <w:szCs w:val="28"/>
     </w:rPr>
   </w:style>
-  <w:style w:type="character" w:customStyle="1" w:styleId="Char0">
-    <w:name w:val="عنوان فرعي Char"/>
-    <w:basedOn w:val="a0"/>
-    <w:link w:val="a4"/>
+  <w:style w:type="character" w:customStyle="1" w:styleId="SubtitleChar">
+    <w:name w:val="Subtitle Char"/>
+    <w:basedOn w:val="DefaultParagraphFont"/>
+    <w:link w:val="Subtitle"/>
     <w:uiPriority w:val="11"/>
     <w:rsid w:val="00D631E6"/>
     <w:rPr>
@@ -9027,11 +9040,11 @@
       <w:szCs w:val="28"/>
     </w:rPr>
   </w:style>
-  <w:style w:type="paragraph" w:styleId="a5">
+  <w:style w:type="paragraph" w:styleId="Quote">
     <w:name w:val="Quote"/>
-    <w:basedOn w:val="a"/>
-    <w:next w:val="a"/>
-    <w:link w:val="Char1"/>
+    <w:basedOn w:val="Normal"/>
+    <w:next w:val="Normal"/>
+    <w:link w:val="QuoteChar"/>
     <w:uiPriority w:val="29"/>
     <w:locked/>
     <w:rsid w:val="00D631E6"/>
@@ -9045,10 +9058,10 @@
       <w:color w:val="404040" w:themeColor="text1" w:themeTint="BF"/>
     </w:rPr>
   </w:style>
-  <w:style w:type="character" w:customStyle="1" w:styleId="Char1">
-    <w:name w:val="اقتباس Char"/>
-    <w:basedOn w:val="a0"/>
-    <w:link w:val="a5"/>
+  <w:style w:type="character" w:customStyle="1" w:styleId="QuoteChar">
+    <w:name w:val="Quote Char"/>
+    <w:basedOn w:val="DefaultParagraphFont"/>
+    <w:link w:val="Quote"/>
     <w:uiPriority w:val="29"/>
     <w:rsid w:val="00D631E6"/>
     <w:rPr>
@@ -9057,11 +9070,11 @@
       <w:color w:val="404040" w:themeColor="text1" w:themeTint="BF"/>
     </w:rPr>
   </w:style>
-  <w:style w:type="paragraph" w:styleId="a6">
+  <w:style w:type="paragraph" w:styleId="ListParagraph">
     <w:name w:val="List Paragraph"/>
     <w:aliases w:val="Dot pt,No Spacing1,List Paragraph Char Char Char,Indicator Text,List Paragraph1,Numbered Para 1,List Paragraph12,Bullet Points,MAIN CONTENT,Bullet 1,Colorful List - Accent 11,F5 List Paragraph,List Paragraph2,Normal numbered,Premier"/>
-    <w:basedOn w:val="a"/>
-    <w:link w:val="Char2"/>
+    <w:basedOn w:val="Normal"/>
+    <w:link w:val="ListParagraphChar"/>
     <w:uiPriority w:val="34"/>
     <w:qFormat/>
     <w:locked/>
@@ -9071,9 +9084,9 @@
       <w:contextualSpacing/>
     </w:pPr>
   </w:style>
-  <w:style w:type="character" w:styleId="a7">
+  <w:style w:type="character" w:styleId="IntenseEmphasis">
     <w:name w:val="Intense Emphasis"/>
-    <w:basedOn w:val="a0"/>
+    <w:basedOn w:val="DefaultParagraphFont"/>
     <w:uiPriority w:val="21"/>
     <w:locked/>
     <w:rsid w:val="00D631E6"/>
@@ -9083,11 +9096,11 @@
       <w:color w:val="B43412" w:themeColor="accent1" w:themeShade="BF"/>
     </w:rPr>
   </w:style>
-  <w:style w:type="paragraph" w:styleId="a8">
+  <w:style w:type="paragraph" w:styleId="IntenseQuote">
     <w:name w:val="Intense Quote"/>
-    <w:basedOn w:val="a"/>
-    <w:next w:val="a"/>
-    <w:link w:val="Char3"/>
+    <w:basedOn w:val="Normal"/>
+    <w:next w:val="Normal"/>
+    <w:link w:val="IntenseQuoteChar"/>
     <w:uiPriority w:val="30"/>
     <w:locked/>
     <w:rsid w:val="00D631E6"/>
@@ -9106,10 +9119,10 @@
       <w:color w:val="B43412" w:themeColor="accent1" w:themeShade="BF"/>
     </w:rPr>
   </w:style>
-  <w:style w:type="character" w:customStyle="1" w:styleId="Char3">
-    <w:name w:val="اقتباس مكثف Char"/>
-    <w:basedOn w:val="a0"/>
-    <w:link w:val="a8"/>
+  <w:style w:type="character" w:customStyle="1" w:styleId="IntenseQuoteChar">
+    <w:name w:val="Intense Quote Char"/>
+    <w:basedOn w:val="DefaultParagraphFont"/>
+    <w:link w:val="IntenseQuote"/>
     <w:uiPriority w:val="30"/>
     <w:rsid w:val="00D631E6"/>
     <w:rPr>
@@ -9118,9 +9131,9 @@
       <w:color w:val="B43412" w:themeColor="accent1" w:themeShade="BF"/>
     </w:rPr>
   </w:style>
-  <w:style w:type="character" w:styleId="a9">
+  <w:style w:type="character" w:styleId="IntenseReference">
     <w:name w:val="Intense Reference"/>
-    <w:basedOn w:val="a0"/>
+    <w:basedOn w:val="DefaultParagraphFont"/>
     <w:uiPriority w:val="32"/>
     <w:locked/>
     <w:rsid w:val="00D631E6"/>
@@ -9132,10 +9145,10 @@
       <w:spacing w:val="5"/>
     </w:rPr>
   </w:style>
-  <w:style w:type="paragraph" w:styleId="aa">
+  <w:style w:type="paragraph" w:styleId="Header">
     <w:name w:val="header"/>
-    <w:basedOn w:val="a"/>
-    <w:link w:val="Char4"/>
+    <w:basedOn w:val="Normal"/>
+    <w:link w:val="HeaderChar"/>
     <w:uiPriority w:val="99"/>
     <w:unhideWhenUsed/>
     <w:locked/>
@@ -9148,17 +9161,17 @@
       <w:spacing w:after="0" w:line="240" w:lineRule="auto"/>
     </w:pPr>
   </w:style>
-  <w:style w:type="character" w:customStyle="1" w:styleId="Char4">
-    <w:name w:val="رأس الصفحة Char"/>
-    <w:basedOn w:val="a0"/>
-    <w:link w:val="aa"/>
+  <w:style w:type="character" w:customStyle="1" w:styleId="HeaderChar">
+    <w:name w:val="Header Char"/>
+    <w:basedOn w:val="DefaultParagraphFont"/>
+    <w:link w:val="Header"/>
     <w:uiPriority w:val="99"/>
     <w:rsid w:val="00306C58"/>
   </w:style>
-  <w:style w:type="paragraph" w:styleId="ab">
+  <w:style w:type="paragraph" w:styleId="Footer">
     <w:name w:val="footer"/>
-    <w:basedOn w:val="a"/>
-    <w:link w:val="Char5"/>
+    <w:basedOn w:val="Normal"/>
+    <w:link w:val="FooterChar"/>
     <w:uiPriority w:val="99"/>
     <w:unhideWhenUsed/>
     <w:locked/>
@@ -9171,16 +9184,16 @@
       <w:spacing w:after="0" w:line="240" w:lineRule="auto"/>
     </w:pPr>
   </w:style>
-  <w:style w:type="character" w:customStyle="1" w:styleId="Char5">
-    <w:name w:val="تذييل الصفحة Char"/>
-    <w:basedOn w:val="a0"/>
-    <w:link w:val="ab"/>
+  <w:style w:type="character" w:customStyle="1" w:styleId="FooterChar">
+    <w:name w:val="Footer Char"/>
+    <w:basedOn w:val="DefaultParagraphFont"/>
+    <w:link w:val="Footer"/>
     <w:uiPriority w:val="99"/>
     <w:rsid w:val="00306C58"/>
   </w:style>
-  <w:style w:type="table" w:styleId="ac">
+  <w:style w:type="table" w:styleId="TableGrid">
     <w:name w:val="Table Grid"/>
-    <w:basedOn w:val="a1"/>
+    <w:basedOn w:val="TableNormal"/>
     <w:uiPriority w:val="39"/>
     <w:locked/>
     <w:rsid w:val="00306C58"/>
@@ -9198,18 +9211,18 @@
       </w:tblBorders>
     </w:tblPr>
   </w:style>
-  <w:style w:type="character" w:customStyle="1" w:styleId="Char2">
-    <w:name w:val="سرد الفقرات Char"/>
+  <w:style w:type="character" w:customStyle="1" w:styleId="ListParagraphChar">
+    <w:name w:val="List Paragraph Char"/>
     <w:aliases w:val="Dot pt Char,No Spacing1 Char,List Paragraph Char Char Char Char,Indicator Text Char,List Paragraph1 Char,Numbered Para 1 Char,List Paragraph12 Char,Bullet Points Char,MAIN CONTENT Char,Bullet 1 Char,Colorful List - Accent 11 Char"/>
-    <w:link w:val="a6"/>
+    <w:link w:val="ListParagraph"/>
     <w:uiPriority w:val="34"/>
     <w:qFormat/>
     <w:locked/>
     <w:rsid w:val="00AB68B8"/>
   </w:style>
-  <w:style w:type="table" w:styleId="4-2">
+  <w:style w:type="table" w:styleId="GridTable4-Accent2">
     <w:name w:val="Grid Table 4 Accent 2"/>
-    <w:basedOn w:val="a1"/>
+    <w:basedOn w:val="TableNormal"/>
     <w:uiPriority w:val="49"/>
     <w:locked/>
     <w:rsid w:val="00AB68B8"/>
@@ -9284,9 +9297,9 @@
       </w:tcPr>
     </w:tblStylePr>
   </w:style>
-  <w:style w:type="table" w:styleId="5-4">
+  <w:style w:type="table" w:styleId="GridTable5Dark-Accent4">
     <w:name w:val="Grid Table 5 Dark Accent 4"/>
-    <w:basedOn w:val="a1"/>
+    <w:basedOn w:val="TableNormal"/>
     <w:uiPriority w:val="50"/>
     <w:locked/>
     <w:rsid w:val="00AB68B8"/>
@@ -9391,9 +9404,9 @@
       </w:tcPr>
     </w:tblStylePr>
   </w:style>
-  <w:style w:type="table" w:styleId="4-4">
+  <w:style w:type="table" w:styleId="GridTable4-Accent4">
     <w:name w:val="Grid Table 4 Accent 4"/>
-    <w:basedOn w:val="a1"/>
+    <w:basedOn w:val="TableNormal"/>
     <w:uiPriority w:val="49"/>
     <w:locked/>
     <w:rsid w:val="00B57C29"/>
@@ -9468,10 +9481,10 @@
       </w:tcPr>
     </w:tblStylePr>
   </w:style>
-  <w:style w:type="paragraph" w:styleId="ad">
+  <w:style w:type="paragraph" w:styleId="CommentText">
     <w:name w:val="annotation text"/>
-    <w:basedOn w:val="a"/>
-    <w:link w:val="Char6"/>
+    <w:basedOn w:val="Normal"/>
+    <w:link w:val="CommentTextChar"/>
     <w:uiPriority w:val="99"/>
     <w:semiHidden/>
     <w:unhideWhenUsed/>
@@ -9485,10 +9498,10 @@
       <w:szCs w:val="20"/>
     </w:rPr>
   </w:style>
-  <w:style w:type="character" w:customStyle="1" w:styleId="Char6">
-    <w:name w:val="نص تعليق Char"/>
-    <w:basedOn w:val="a0"/>
-    <w:link w:val="ad"/>
+  <w:style w:type="character" w:customStyle="1" w:styleId="CommentTextChar">
+    <w:name w:val="Comment Text Char"/>
+    <w:basedOn w:val="DefaultParagraphFont"/>
+    <w:link w:val="CommentText"/>
     <w:uiPriority w:val="99"/>
     <w:semiHidden/>
     <w:rsid w:val="00F2173B"/>
@@ -9497,11 +9510,11 @@
       <w:szCs w:val="20"/>
     </w:rPr>
   </w:style>
-  <w:style w:type="paragraph" w:styleId="ae">
+  <w:style w:type="paragraph" w:styleId="CommentSubject">
     <w:name w:val="annotation subject"/>
-    <w:basedOn w:val="ad"/>
-    <w:next w:val="ad"/>
-    <w:link w:val="Char7"/>
+    <w:basedOn w:val="CommentText"/>
+    <w:next w:val="CommentText"/>
+    <w:link w:val="CommentSubjectChar"/>
     <w:uiPriority w:val="99"/>
     <w:semiHidden/>
     <w:unhideWhenUsed/>
@@ -9519,10 +9532,10 @@
       <w14:ligatures w14:val="none"/>
     </w:rPr>
   </w:style>
-  <w:style w:type="character" w:customStyle="1" w:styleId="Char7">
-    <w:name w:val="موضوع تعليق Char"/>
-    <w:basedOn w:val="Char6"/>
-    <w:link w:val="ae"/>
+  <w:style w:type="character" w:customStyle="1" w:styleId="CommentSubjectChar">
+    <w:name w:val="Comment Subject Char"/>
+    <w:basedOn w:val="CommentTextChar"/>
+    <w:link w:val="CommentSubject"/>
     <w:uiPriority w:val="99"/>
     <w:semiHidden/>
     <w:rsid w:val="00F2173B"/>
@@ -9537,9 +9550,9 @@
       <w14:ligatures w14:val="none"/>
     </w:rPr>
   </w:style>
-  <w:style w:type="table" w:styleId="3-6">
+  <w:style w:type="table" w:styleId="ListTable3-Accent6">
     <w:name w:val="List Table 3 Accent 6"/>
-    <w:basedOn w:val="a1"/>
+    <w:basedOn w:val="TableNormal"/>
     <w:uiPriority w:val="48"/>
     <w:locked/>
     <w:rsid w:val="00F2173B"/>
@@ -9668,9 +9681,9 @@
       </w:tcPr>
     </w:tblStylePr>
   </w:style>
-  <w:style w:type="table" w:styleId="3-1">
+  <w:style w:type="table" w:styleId="ListTable3-Accent1">
     <w:name w:val="List Table 3 Accent 1"/>
-    <w:basedOn w:val="a1"/>
+    <w:basedOn w:val="TableNormal"/>
     <w:uiPriority w:val="48"/>
     <w:locked/>
     <w:rsid w:val="00F2173B"/>
@@ -9793,9 +9806,9 @@
       </w:tcPr>
     </w:tblStylePr>
   </w:style>
-  <w:style w:type="table" w:styleId="3-2">
+  <w:style w:type="table" w:styleId="ListTable3-Accent2">
     <w:name w:val="List Table 3 Accent 2"/>
-    <w:basedOn w:val="a1"/>
+    <w:basedOn w:val="TableNormal"/>
     <w:uiPriority w:val="48"/>
     <w:locked/>
     <w:rsid w:val="00F2173B"/>
@@ -9920,7 +9933,7 @@
   </w:style>
   <w:style w:type="character" w:styleId="Hyperlink">
     <w:name w:val="Hyperlink"/>
-    <w:basedOn w:val="a0"/>
+    <w:basedOn w:val="DefaultParagraphFont"/>
     <w:uiPriority w:val="99"/>
     <w:unhideWhenUsed/>
     <w:locked/>
@@ -9930,9 +9943,9 @@
       <w:u w:val="single"/>
     </w:rPr>
   </w:style>
-  <w:style w:type="character" w:styleId="af">
+  <w:style w:type="character" w:styleId="UnresolvedMention">
     <w:name w:val="Unresolved Mention"/>
-    <w:basedOn w:val="a0"/>
+    <w:basedOn w:val="DefaultParagraphFont"/>
     <w:uiPriority w:val="99"/>
     <w:semiHidden/>
     <w:unhideWhenUsed/>
@@ -9943,9 +9956,9 @@
       <w:shd w:val="clear" w:color="auto" w:fill="E1DFDD"/>
     </w:rPr>
   </w:style>
-  <w:style w:type="table" w:styleId="5-6">
+  <w:style w:type="table" w:styleId="GridTable5Dark-Accent6">
     <w:name w:val="Grid Table 5 Dark Accent 6"/>
-    <w:basedOn w:val="a1"/>
+    <w:basedOn w:val="TableNormal"/>
     <w:uiPriority w:val="50"/>
     <w:locked/>
     <w:rsid w:val="00F2173B"/>
@@ -10056,7 +10069,7 @@
       </w:tcPr>
     </w:tblStylePr>
   </w:style>
-  <w:style w:type="paragraph" w:styleId="af0">
+  <w:style w:type="paragraph" w:styleId="Revision">
     <w:name w:val="Revision"/>
     <w:hidden/>
     <w:uiPriority w:val="99"/>
@@ -10069,9 +10082,9 @@
       <w:rFonts w:ascii="Sakkal Majalla" w:eastAsia="Sakkal Majalla" w:hAnsi="Sakkal Majalla" w:cs="Sakkal Majalla"/>
     </w:rPr>
   </w:style>
-  <w:style w:type="paragraph" w:styleId="af1">
+  <w:style w:type="paragraph" w:styleId="NormalWeb">
     <w:name w:val="Normal (Web)"/>
-    <w:basedOn w:val="a"/>
+    <w:basedOn w:val="Normal"/>
     <w:uiPriority w:val="99"/>
     <w:semiHidden/>
     <w:unhideWhenUsed/>

</xml_diff>